<commit_message>
FINISHED catalog page, FINISHED about page, and FINISHED our styles page.
</commit_message>
<xml_diff>
--- a/Citations.docx
+++ b/Citations.docx
@@ -28,12 +28,29 @@
       </w:r>
     </w:p>
     <w:p>
+      <w:r>
+        <w:t>Logo</w:t>
+      </w:r>
+    </w:p>
+    <w:p>
       <w:hyperlink r:id="rId4" w:history="1">
         <w:r>
           <w:rPr>
             <w:rStyle w:val="Hyperlink"/>
           </w:rPr>
-          <w:t>https://pixabay.com/vectors/rabbit-hare-silhouette-animal-sign-7829705/</w:t>
+          <w:t>https://pixabay.com/vect</w:t>
+        </w:r>
+        <w:r>
+          <w:rPr>
+            <w:rStyle w:val="Hyperlink"/>
+          </w:rPr>
+          <w:t>o</w:t>
+        </w:r>
+        <w:r>
+          <w:rPr>
+            <w:rStyle w:val="Hyperlink"/>
+          </w:rPr>
+          <w:t>rs/rabbit-hare-silhouette-animal-sign-7829705/</w:t>
         </w:r>
       </w:hyperlink>
     </w:p>
@@ -49,19 +66,7 @@
           <w:rPr>
             <w:rStyle w:val="Hyperlink"/>
           </w:rPr>
-          <w:t>https://www.pexels.com/photo/wo</w:t>
-        </w:r>
-        <w:r>
-          <w:rPr>
-            <w:rStyle w:val="Hyperlink"/>
-          </w:rPr>
-          <w:t>m</w:t>
-        </w:r>
-        <w:r>
-          <w:rPr>
-            <w:rStyle w:val="Hyperlink"/>
-          </w:rPr>
-          <w:t>an-in-a-black-dress-oddly-holding-a-dry-bouquet-of-roses-3019613/</w:t>
+          <w:t>https://www.pexels.com/photo/woman-in-a-black-dress-oddly-holding-a-dry-bouquet-of-roses-3019613/</w:t>
         </w:r>
       </w:hyperlink>
     </w:p>
@@ -71,19 +76,7 @@
           <w:rPr>
             <w:rStyle w:val="Hyperlink"/>
           </w:rPr>
-          <w:t>https://www.pe</w:t>
-        </w:r>
-        <w:r>
-          <w:rPr>
-            <w:rStyle w:val="Hyperlink"/>
-          </w:rPr>
-          <w:t>x</w:t>
-        </w:r>
-        <w:r>
-          <w:rPr>
-            <w:rStyle w:val="Hyperlink"/>
-          </w:rPr>
-          <w:t>els.com/photo/woman-in-black-dress-standing-near-brown-tree-6031518/</w:t>
+          <w:t>https://www.pexels.com/photo/woman-in-black-dress-standing-near-brown-tree-6031518/</w:t>
         </w:r>
       </w:hyperlink>
     </w:p>
@@ -93,19 +86,7 @@
           <w:rPr>
             <w:rStyle w:val="Hyperlink"/>
           </w:rPr>
-          <w:t>https://www.pexels.com/photo/a-wo</w:t>
-        </w:r>
-        <w:r>
-          <w:rPr>
-            <w:rStyle w:val="Hyperlink"/>
-          </w:rPr>
-          <w:t>m</w:t>
-        </w:r>
-        <w:r>
-          <w:rPr>
-            <w:rStyle w:val="Hyperlink"/>
-          </w:rPr>
-          <w:t>an-in-a-gothic-dress-posing-in-the-grass-18454809/</w:t>
+          <w:t>https://www.pexels.com/photo/a-woman-in-a-gothic-dress-posing-in-the-grass-18454809/</w:t>
         </w:r>
       </w:hyperlink>
     </w:p>
@@ -115,19 +96,7 @@
           <w:rPr>
             <w:rStyle w:val="Hyperlink"/>
           </w:rPr>
-          <w:t>https://pixabay.com/photo</w:t>
-        </w:r>
-        <w:r>
-          <w:rPr>
-            <w:rStyle w:val="Hyperlink"/>
-          </w:rPr>
-          <w:t>s</w:t>
-        </w:r>
-        <w:r>
-          <w:rPr>
-            <w:rStyle w:val="Hyperlink"/>
-          </w:rPr>
-          <w:t>/creepers-monster-cyber-creepy-rock-9653850/</w:t>
+          <w:t>https://pixabay.com/photos/creepers-monster-cyber-creepy-rock-9653850/</w:t>
         </w:r>
       </w:hyperlink>
     </w:p>
@@ -137,19 +106,7 @@
           <w:rPr>
             <w:rStyle w:val="Hyperlink"/>
           </w:rPr>
-          <w:t>https://pixabay.com/photos/woman-model-creepers-cr</w:t>
-        </w:r>
-        <w:r>
-          <w:rPr>
-            <w:rStyle w:val="Hyperlink"/>
-          </w:rPr>
-          <w:t>e</w:t>
-        </w:r>
-        <w:r>
-          <w:rPr>
-            <w:rStyle w:val="Hyperlink"/>
-          </w:rPr>
-          <w:t>epy-rock-9566584/</w:t>
+          <w:t>https://pixabay.com/photos/woman-model-creepers-creepy-rock-9566584/</w:t>
         </w:r>
       </w:hyperlink>
     </w:p>
@@ -170,6 +127,16 @@
             <w:rStyle w:val="Hyperlink"/>
           </w:rPr>
           <w:t>https://unsplash.com/photos/a-woman-poses-in-a-black-gothic-outfit-Xqy-VJQmnNk</w:t>
+        </w:r>
+      </w:hyperlink>
+    </w:p>
+    <w:p>
+      <w:hyperlink r:id="rId12" w:history="1">
+        <w:r>
+          <w:rPr>
+            <w:rStyle w:val="Hyperlink"/>
+          </w:rPr>
+          <w:t>https://unsplash.com/photos/a-woman-twirls-in-front-of-an-industrial-backdrop-gvoxf2r2Xng</w:t>
         </w:r>
       </w:hyperlink>
     </w:p>
@@ -180,46 +147,12 @@
       </w:r>
     </w:p>
     <w:p>
-      <w:hyperlink r:id="rId12" w:history="1">
-        <w:r>
-          <w:rPr>
-            <w:rStyle w:val="Hyperlink"/>
-          </w:rPr>
-          <w:t>https://www.pe</w:t>
-        </w:r>
-        <w:r>
-          <w:rPr>
-            <w:rStyle w:val="Hyperlink"/>
-          </w:rPr>
-          <w:t>x</w:t>
-        </w:r>
-        <w:r>
-          <w:rPr>
-            <w:rStyle w:val="Hyperlink"/>
-          </w:rPr>
-          <w:t>els.com/photo/beautiful-woman-wearing-a-black-hat-5212475/</w:t>
-        </w:r>
-      </w:hyperlink>
-    </w:p>
-    <w:p>
       <w:hyperlink r:id="rId13" w:history="1">
         <w:r>
           <w:rPr>
             <w:rStyle w:val="Hyperlink"/>
           </w:rPr>
-          <w:t>https://pixabay.com/photos/got</w:t>
-        </w:r>
-        <w:r>
-          <w:rPr>
-            <w:rStyle w:val="Hyperlink"/>
-          </w:rPr>
-          <w:t>h</w:t>
-        </w:r>
-        <w:r>
-          <w:rPr>
-            <w:rStyle w:val="Hyperlink"/>
-          </w:rPr>
-          <w:t>-gothic-goth-festival-pretty-3790614/</w:t>
+          <w:t>https://www.pexels.com/photo/beautiful-woman-wearing-a-black-hat-5212475/</w:t>
         </w:r>
       </w:hyperlink>
     </w:p>
@@ -229,12 +162,22 @@
           <w:rPr>
             <w:rStyle w:val="Hyperlink"/>
           </w:rPr>
+          <w:t>https://pixabay.com/photos/goth-gothic-goth-festival-pretty-3790614/</w:t>
+        </w:r>
+      </w:hyperlink>
+    </w:p>
+    <w:p>
+      <w:hyperlink r:id="rId15" w:history="1">
+        <w:r>
+          <w:rPr>
+            <w:rStyle w:val="Hyperlink"/>
+          </w:rPr>
           <w:t>https://unsplash.com/photos/a-man-with-dreadlocks-sitting-on-a-rail-0YhPHyHYBug</w:t>
         </w:r>
       </w:hyperlink>
     </w:p>
     <w:p>
-      <w:hyperlink r:id="rId15" w:history="1">
+      <w:hyperlink r:id="rId16" w:history="1">
         <w:r>
           <w:rPr>
             <w:rStyle w:val="Hyperlink"/>
@@ -244,112 +187,15 @@
       </w:hyperlink>
     </w:p>
     <w:p>
-      <w:hyperlink r:id="rId16" w:history="1">
-        <w:r>
-          <w:rPr>
-            <w:rStyle w:val="Hyperlink"/>
-          </w:rPr>
-          <w:t>https://unsplash.com/photos/a</w:t>
-        </w:r>
-        <w:r>
-          <w:rPr>
-            <w:rStyle w:val="Hyperlink"/>
-          </w:rPr>
-          <w:t>-</w:t>
-        </w:r>
-        <w:r>
-          <w:rPr>
-            <w:rStyle w:val="Hyperlink"/>
-          </w:rPr>
-          <w:t>woman-wearing-glasses-and-a-black-shirt-fbx8AbpAVqU</w:t>
-        </w:r>
-      </w:hyperlink>
-    </w:p>
-    <w:p/>
-    <w:p>
-      <w:r>
-        <w:t>IDK</w:t>
-      </w:r>
-    </w:p>
-    <w:p>
       <w:hyperlink r:id="rId17" w:history="1">
         <w:r>
           <w:rPr>
             <w:rStyle w:val="Hyperlink"/>
           </w:rPr>
-          <w:t>https://pixabay</w:t>
-        </w:r>
-        <w:r>
-          <w:rPr>
-            <w:rStyle w:val="Hyperlink"/>
-          </w:rPr>
-          <w:t>.</w:t>
-        </w:r>
-        <w:r>
-          <w:rPr>
-            <w:rStyle w:val="Hyperlink"/>
-          </w:rPr>
-          <w:t>com/ph</w:t>
-        </w:r>
-        <w:r>
-          <w:rPr>
-            <w:rStyle w:val="Hyperlink"/>
-          </w:rPr>
-          <w:t>o</w:t>
-        </w:r>
-        <w:r>
-          <w:rPr>
-            <w:rStyle w:val="Hyperlink"/>
-          </w:rPr>
-          <w:t>tos/model-rock-punk-goth-aesthetic-9657422/</w:t>
-        </w:r>
-      </w:hyperlink>
-    </w:p>
-    <w:p>
-      <w:hyperlink r:id="rId18" w:history="1">
-        <w:r>
-          <w:rPr>
-            <w:rStyle w:val="Hyperlink"/>
-          </w:rPr>
-          <w:t>https://p</w:t>
-        </w:r>
-        <w:r>
-          <w:rPr>
-            <w:rStyle w:val="Hyperlink"/>
-          </w:rPr>
-          <w:t>i</w:t>
-        </w:r>
-        <w:r>
-          <w:rPr>
-            <w:rStyle w:val="Hyperlink"/>
-          </w:rPr>
-          <w:t>xabay.com/photos/model-rock-punk-goth-aesthetic-9657429/</w:t>
-        </w:r>
-      </w:hyperlink>
-    </w:p>
-    <w:p>
-      <w:hyperlink r:id="rId19" w:history="1">
-        <w:r>
-          <w:rPr>
-            <w:rStyle w:val="Hyperlink"/>
-          </w:rPr>
-          <w:t>https://pixabay.com/photos</w:t>
-        </w:r>
-        <w:r>
-          <w:rPr>
-            <w:rStyle w:val="Hyperlink"/>
-          </w:rPr>
-          <w:t>/</w:t>
-        </w:r>
-        <w:r>
-          <w:rPr>
-            <w:rStyle w:val="Hyperlink"/>
-          </w:rPr>
-          <w:t>woman-model-creepers-monster-cyber-9651149/</w:t>
-        </w:r>
-      </w:hyperlink>
-    </w:p>
-    <w:p/>
+          <w:t>https://unsplash.com/photos/a-woman-wearing-glasses-and-a-black-shirt-fbx8AbpAVqU</w:t>
+        </w:r>
+      </w:hyperlink>
+    </w:p>
     <w:p/>
     <w:p>
       <w:r>
@@ -357,12 +203,32 @@
       </w:r>
     </w:p>
     <w:p>
+      <w:hyperlink r:id="rId18" w:history="1">
+        <w:r>
+          <w:rPr>
+            <w:rStyle w:val="Hyperlink"/>
+          </w:rPr>
+          <w:t>https://pixabay.com/photos/woman-model-creepers-monster-cyber-9651175/</w:t>
+        </w:r>
+      </w:hyperlink>
+    </w:p>
+    <w:p>
+      <w:hyperlink r:id="rId19" w:history="1">
+        <w:r>
+          <w:rPr>
+            <w:rStyle w:val="Hyperlink"/>
+          </w:rPr>
+          <w:t>https://pixabay.com/photos/hat-cap-fashion-model-girl-8879866/</w:t>
+        </w:r>
+      </w:hyperlink>
+    </w:p>
+    <w:p>
       <w:hyperlink r:id="rId20" w:history="1">
         <w:r>
           <w:rPr>
             <w:rStyle w:val="Hyperlink"/>
           </w:rPr>
-          <w:t>https://pixabay.com/photos/woman-model-creepers-monster-cyber-9651175/</w:t>
+          <w:t>https://pixabay.com/photos/western-hat-animal-cowboy-fantasy-8879861/</w:t>
         </w:r>
       </w:hyperlink>
     </w:p>
@@ -372,9 +238,15 @@
           <w:rPr>
             <w:rStyle w:val="Hyperlink"/>
           </w:rPr>
-          <w:t>https://pixabay.com/photos/hat-cap-fashion-model-girl-8879866/</w:t>
-        </w:r>
-      </w:hyperlink>
+          <w:t>https://unsplash.com/photos/a-woman-in-a-dark-headscarf-and-dress-stands-outside-SN6iygPIPnw</w:t>
+        </w:r>
+      </w:hyperlink>
+    </w:p>
+    <w:p/>
+    <w:p>
+      <w:r>
+        <w:t>Banners</w:t>
+      </w:r>
     </w:p>
     <w:p>
       <w:hyperlink r:id="rId22" w:history="1">
@@ -382,19 +254,7 @@
           <w:rPr>
             <w:rStyle w:val="Hyperlink"/>
           </w:rPr>
-          <w:t>https://pixabay.com/photos/western-hat-animal-cowboy-fa</w:t>
-        </w:r>
-        <w:r>
-          <w:rPr>
-            <w:rStyle w:val="Hyperlink"/>
-          </w:rPr>
-          <w:t>n</w:t>
-        </w:r>
-        <w:r>
-          <w:rPr>
-            <w:rStyle w:val="Hyperlink"/>
-          </w:rPr>
-          <w:t>tasy-8879861/</w:t>
+          <w:t>https://unsplash.com/photos/a-group-of-women-dressed-up-in-witches-costumes-IzBFvkhf_HI</w:t>
         </w:r>
       </w:hyperlink>
     </w:p>
@@ -404,11 +264,152 @@
           <w:rPr>
             <w:rStyle w:val="Hyperlink"/>
           </w:rPr>
-          <w:t>https://unsplash.com/photos/a-woman-in-a-dark-headscarf-and-dress-stands-outside-SN6iygPIPnw</w:t>
+          <w:t>https://www.pexels.com/photo/table-setting-with-candles-and-skull-4992863/</w:t>
+        </w:r>
+      </w:hyperlink>
+    </w:p>
+    <w:p>
+      <w:hyperlink r:id="rId24" w:history="1">
+        <w:r>
+          <w:rPr>
+            <w:rStyle w:val="Hyperlink"/>
+          </w:rPr>
+          <w:t>https://unsplash.com/photos/a-black-object-on-a-tree-stump-EN88mEDYO-0</w:t>
+        </w:r>
+      </w:hyperlink>
+    </w:p>
+    <w:p>
+      <w:hyperlink r:id="rId25" w:history="1">
+        <w:r>
+          <w:rPr>
+            <w:rStyle w:val="Hyperlink"/>
+          </w:rPr>
+          <w:t>https://www.pexels.com/photo/a-triangle-sign-surrounded-by-crystals-on-a-black-surface-6806708/</w:t>
+        </w:r>
+      </w:hyperlink>
+    </w:p>
+    <w:p>
+      <w:hyperlink r:id="rId26" w:history="1">
+        <w:r>
+          <w:rPr>
+            <w:rStyle w:val="Hyperlink"/>
+          </w:rPr>
+          <w:t>https://unsplash.com/photos/assorted-stones-MnKWt1W1GDg</w:t>
         </w:r>
       </w:hyperlink>
     </w:p>
     <w:p/>
+    <w:p/>
+    <w:p>
+      <w:hyperlink r:id="rId27" w:history="1">
+        <w:r>
+          <w:rPr>
+            <w:rStyle w:val="Hyperlink"/>
+          </w:rPr>
+          <w:t>https://www.pexels.com/photo/candles-and-book-on-ritual-table-19997863/</w:t>
+        </w:r>
+      </w:hyperlink>
+    </w:p>
+    <w:p>
+      <w:hyperlink r:id="rId28" w:history="1">
+        <w:r>
+          <w:rPr>
+            <w:rStyle w:val="Hyperlink"/>
+          </w:rPr>
+          <w:t>https://www.pexels.com/photo/ritual-accessories-on-tab</w:t>
+        </w:r>
+        <w:r>
+          <w:rPr>
+            <w:rStyle w:val="Hyperlink"/>
+          </w:rPr>
+          <w:t>l</w:t>
+        </w:r>
+        <w:r>
+          <w:rPr>
+            <w:rStyle w:val="Hyperlink"/>
+          </w:rPr>
+          <w:t>e-19997862/</w:t>
+        </w:r>
+      </w:hyperlink>
+    </w:p>
+    <w:p>
+      <w:hyperlink r:id="rId29" w:history="1">
+        <w:r>
+          <w:rPr>
+            <w:rStyle w:val="Hyperlink"/>
+          </w:rPr>
+          <w:t>https://unsplash.com/photos/a-wooden-box-filled-with-pine-cones-and-other-items-KwcGk30kkec</w:t>
+        </w:r>
+      </w:hyperlink>
+    </w:p>
+    <w:p/>
+    <w:p/>
+    <w:p>
+      <w:r>
+        <w:lastRenderedPageBreak/>
+        <w:t>Plushies</w:t>
+      </w:r>
+    </w:p>
+    <w:p>
+      <w:hyperlink r:id="rId30" w:history="1">
+        <w:r>
+          <w:rPr>
+            <w:rStyle w:val="Hyperlink"/>
+          </w:rPr>
+          <w:t>https://www.pexels.com/photo/white-rabbit-plush-toy-688311/</w:t>
+        </w:r>
+      </w:hyperlink>
+    </w:p>
+    <w:p>
+      <w:hyperlink r:id="rId31" w:history="1">
+        <w:r>
+          <w:rPr>
+            <w:rStyle w:val="Hyperlink"/>
+          </w:rPr>
+          <w:t>https://www.pexels.com/photo/jack-skelington-vinyl-figure-619419/</w:t>
+        </w:r>
+      </w:hyperlink>
+    </w:p>
+    <w:p>
+      <w:hyperlink r:id="rId32" w:history="1">
+        <w:r>
+          <w:rPr>
+            <w:rStyle w:val="Hyperlink"/>
+          </w:rPr>
+          <w:t>https://www.pexels.com/photo/brown-teddy-bear-sitting-on-edge-of-pavement-105531/</w:t>
+        </w:r>
+      </w:hyperlink>
+    </w:p>
+    <w:p>
+      <w:hyperlink r:id="rId33" w:history="1">
+        <w:r>
+          <w:rPr>
+            <w:rStyle w:val="Hyperlink"/>
+          </w:rPr>
+          <w:t>https://www.pexels.com/photo/a-scary-clown-costume-10185608/</w:t>
+        </w:r>
+      </w:hyperlink>
+    </w:p>
+    <w:p>
+      <w:hyperlink r:id="rId34" w:history="1">
+        <w:r>
+          <w:rPr>
+            <w:rStyle w:val="Hyperlink"/>
+          </w:rPr>
+          <w:t>https://unsplash.com/photos/plush-skeleton-toy-attached-to-weathered-wooden-post-5O4fpYPt6hU</w:t>
+        </w:r>
+      </w:hyperlink>
+    </w:p>
+    <w:p>
+      <w:hyperlink r:id="rId35" w:history="1">
+        <w:r>
+          <w:rPr>
+            <w:rStyle w:val="Hyperlink"/>
+          </w:rPr>
+          <w:t>https://unsplash.com/photos/a-stuffed-animal-with-big-eyes-and-a-mouth-MS3Xuuadl4E</w:t>
+        </w:r>
+      </w:hyperlink>
+    </w:p>
     <w:p/>
     <w:sectPr>
       <w:pgSz w:w="12240" w:h="15840"/>

</xml_diff>

<commit_message>
fixed [id] page error with array, added preview section to home page, & got standardized imgs
</commit_message>
<xml_diff>
--- a/Citations.docx
+++ b/Citations.docx
@@ -19,7 +19,13 @@
     </w:p>
     <w:p>
       <w:r>
-        <w:t>March X, 2026</w:t>
+        <w:t xml:space="preserve">March </w:t>
+      </w:r>
+      <w:r>
+        <w:t>15</w:t>
+      </w:r>
+      <w:r>
+        <w:t>, 2026</w:t>
       </w:r>
     </w:p>
     <w:p>
@@ -27,30 +33,19 @@
         <w:t>Final Project Citations</w:t>
       </w:r>
     </w:p>
+    <w:p/>
     <w:p>
       <w:r>
         <w:t>Logo</w:t>
       </w:r>
     </w:p>
     <w:p>
-      <w:hyperlink r:id="rId4" w:history="1">
-        <w:r>
-          <w:rPr>
-            <w:rStyle w:val="Hyperlink"/>
-          </w:rPr>
-          <w:t>https://pixabay.com/vect</w:t>
-        </w:r>
-        <w:r>
-          <w:rPr>
-            <w:rStyle w:val="Hyperlink"/>
-          </w:rPr>
-          <w:t>o</w:t>
-        </w:r>
-        <w:r>
-          <w:rPr>
-            <w:rStyle w:val="Hyperlink"/>
-          </w:rPr>
-          <w:t>rs/rabbit-hare-silhouette-animal-sign-7829705/</w:t>
+      <w:hyperlink r:id="rId5" w:history="1">
+        <w:r>
+          <w:rPr>
+            <w:rStyle w:val="Hyperlink"/>
+          </w:rPr>
+          <w:t>https://pixabay.com/vectors/rabbit-hare-silhouette-animal-sign-7829705/</w:t>
         </w:r>
       </w:hyperlink>
     </w:p>
@@ -61,22 +56,36 @@
       </w:r>
     </w:p>
     <w:p>
-      <w:hyperlink r:id="rId5" w:history="1">
-        <w:r>
-          <w:rPr>
-            <w:rStyle w:val="Hyperlink"/>
-          </w:rPr>
-          <w:t>https://www.pexels.com/photo/woman-in-a-black-dress-oddly-holding-a-dry-bouquet-of-roses-3019613/</w:t>
-        </w:r>
-      </w:hyperlink>
-    </w:p>
-    <w:p>
       <w:hyperlink r:id="rId6" w:history="1">
         <w:r>
           <w:rPr>
             <w:rStyle w:val="Hyperlink"/>
           </w:rPr>
-          <w:t>https://www.pexels.com/photo/woman-in-black-dress-standing-near-brown-tree-6031518/</w:t>
+          <w:t>https://pixabay.com/photos/creepers-monster-cyber-cr</w:t>
+        </w:r>
+        <w:r>
+          <w:rPr>
+            <w:rStyle w:val="Hyperlink"/>
+          </w:rPr>
+          <w:t>e</w:t>
+        </w:r>
+        <w:r>
+          <w:rPr>
+            <w:rStyle w:val="Hyperlink"/>
+          </w:rPr>
+          <w:t>epy-rock-</w:t>
+        </w:r>
+        <w:r>
+          <w:rPr>
+            <w:rStyle w:val="Hyperlink"/>
+          </w:rPr>
+          <w:t>9</w:t>
+        </w:r>
+        <w:r>
+          <w:rPr>
+            <w:rStyle w:val="Hyperlink"/>
+          </w:rPr>
+          <w:t>262162/</w:t>
         </w:r>
       </w:hyperlink>
     </w:p>
@@ -86,7 +95,19 @@
           <w:rPr>
             <w:rStyle w:val="Hyperlink"/>
           </w:rPr>
-          <w:t>https://www.pexels.com/photo/a-woman-in-a-gothic-dress-posing-in-the-grass-18454809/</w:t>
+          <w:t>https://pixabay.com/photos/model-creepers-monster-cy</w:t>
+        </w:r>
+        <w:r>
+          <w:rPr>
+            <w:rStyle w:val="Hyperlink"/>
+          </w:rPr>
+          <w:t>b</w:t>
+        </w:r>
+        <w:r>
+          <w:rPr>
+            <w:rStyle w:val="Hyperlink"/>
+          </w:rPr>
+          <w:t>er-9566573/</w:t>
         </w:r>
       </w:hyperlink>
     </w:p>
@@ -96,7 +117,31 @@
           <w:rPr>
             <w:rStyle w:val="Hyperlink"/>
           </w:rPr>
-          <w:t>https://pixabay.com/photos/creepers-monster-cyber-creepy-rock-9653850/</w:t>
+          <w:t>https://pixabay.com/photos/model-rock-punk-goth-a</w:t>
+        </w:r>
+        <w:r>
+          <w:rPr>
+            <w:rStyle w:val="Hyperlink"/>
+          </w:rPr>
+          <w:t>e</w:t>
+        </w:r>
+        <w:r>
+          <w:rPr>
+            <w:rStyle w:val="Hyperlink"/>
+          </w:rPr>
+          <w:t>sthetic-96</w:t>
+        </w:r>
+        <w:r>
+          <w:rPr>
+            <w:rStyle w:val="Hyperlink"/>
+          </w:rPr>
+          <w:t>5</w:t>
+        </w:r>
+        <w:r>
+          <w:rPr>
+            <w:rStyle w:val="Hyperlink"/>
+          </w:rPr>
+          <w:t>7424/</w:t>
         </w:r>
       </w:hyperlink>
     </w:p>
@@ -106,7 +151,7 @@
           <w:rPr>
             <w:rStyle w:val="Hyperlink"/>
           </w:rPr>
-          <w:t>https://pixabay.com/photos/woman-model-creepers-creepy-rock-9566584/</w:t>
+          <w:t>https://pixabay.com/photos/creepers-monster-cyber-creepy-rock-9626430/</w:t>
         </w:r>
       </w:hyperlink>
     </w:p>
@@ -116,7 +161,19 @@
           <w:rPr>
             <w:rStyle w:val="Hyperlink"/>
           </w:rPr>
-          <w:t>https://unsplash.com/photos/a-woman-with-blue-hair-sitting-on-some-steps-97oSnYhyLfs</w:t>
+          <w:t>https://pixabay.com/photos/creepers-monster-cyber-creepy-rock-9</w:t>
+        </w:r>
+        <w:r>
+          <w:rPr>
+            <w:rStyle w:val="Hyperlink"/>
+          </w:rPr>
+          <w:t>6</w:t>
+        </w:r>
+        <w:r>
+          <w:rPr>
+            <w:rStyle w:val="Hyperlink"/>
+          </w:rPr>
+          <w:t>53850/</w:t>
         </w:r>
       </w:hyperlink>
     </w:p>
@@ -126,7 +183,19 @@
           <w:rPr>
             <w:rStyle w:val="Hyperlink"/>
           </w:rPr>
-          <w:t>https://unsplash.com/photos/a-woman-poses-in-a-black-gothic-outfit-Xqy-VJQmnNk</w:t>
+          <w:t>https://pixabay.com/photos/woman-model-creepers-creepy-rock</w:t>
+        </w:r>
+        <w:r>
+          <w:rPr>
+            <w:rStyle w:val="Hyperlink"/>
+          </w:rPr>
+          <w:t>-</w:t>
+        </w:r>
+        <w:r>
+          <w:rPr>
+            <w:rStyle w:val="Hyperlink"/>
+          </w:rPr>
+          <w:t>9566584/</w:t>
         </w:r>
       </w:hyperlink>
     </w:p>
@@ -136,7 +205,19 @@
           <w:rPr>
             <w:rStyle w:val="Hyperlink"/>
           </w:rPr>
-          <w:t>https://unsplash.com/photos/a-woman-twirls-in-front-of-an-industrial-backdrop-gvoxf2r2Xng</w:t>
+          <w:t>https://pixabay.com/photos/creepers-monster-cyber-creepy-rock</w:t>
+        </w:r>
+        <w:r>
+          <w:rPr>
+            <w:rStyle w:val="Hyperlink"/>
+          </w:rPr>
+          <w:t>-</w:t>
+        </w:r>
+        <w:r>
+          <w:rPr>
+            <w:rStyle w:val="Hyperlink"/>
+          </w:rPr>
+          <w:t>9773182/</w:t>
         </w:r>
       </w:hyperlink>
     </w:p>
@@ -152,7 +233,7 @@
           <w:rPr>
             <w:rStyle w:val="Hyperlink"/>
           </w:rPr>
-          <w:t>https://www.pexels.com/photo/beautiful-woman-wearing-a-black-hat-5212475/</w:t>
+          <w:t>https://pixabay.com/photos/model-rock-punk-goth-aesthetic-9657423/</w:t>
         </w:r>
       </w:hyperlink>
     </w:p>
@@ -162,7 +243,7 @@
           <w:rPr>
             <w:rStyle w:val="Hyperlink"/>
           </w:rPr>
-          <w:t>https://pixabay.com/photos/goth-gothic-goth-festival-pretty-3790614/</w:t>
+          <w:t>https://pixabay.com/photos/cyber-creepy-rock-punk-8889322/</w:t>
         </w:r>
       </w:hyperlink>
     </w:p>
@@ -172,7 +253,7 @@
           <w:rPr>
             <w:rStyle w:val="Hyperlink"/>
           </w:rPr>
-          <w:t>https://unsplash.com/photos/a-man-with-dreadlocks-sitting-on-a-rail-0YhPHyHYBug</w:t>
+          <w:t>https://pixabay.com/photos/creepers-monster-cyber-creepy-rock-9626511/</w:t>
         </w:r>
       </w:hyperlink>
     </w:p>
@@ -182,7 +263,7 @@
           <w:rPr>
             <w:rStyle w:val="Hyperlink"/>
           </w:rPr>
-          <w:t>https://unsplash.com/photos/a-woman-poses-with-a-serious-intense-expression-EnI14ekn1KY</w:t>
+          <w:t>https://pixabay.com/photos/woman-model-creepers-creepy-rock-9566535/</w:t>
         </w:r>
       </w:hyperlink>
     </w:p>
@@ -192,13 +273,19 @@
           <w:rPr>
             <w:rStyle w:val="Hyperlink"/>
           </w:rPr>
-          <w:t>https://unsplash.com/photos/a-woman-wearing-glasses-and-a-black-shirt-fbx8AbpAVqU</w:t>
-        </w:r>
-      </w:hyperlink>
+          <w:t>https://pixabay.com/photos/woman-gothic-goth-halloween-dark-8856198/</w:t>
+        </w:r>
+      </w:hyperlink>
+    </w:p>
+    <w:p>
+      <w:pPr>
+        <w:ind w:left="360"/>
+      </w:pPr>
     </w:p>
     <w:p/>
     <w:p>
       <w:r>
+        <w:lastRenderedPageBreak/>
         <w:t>Accessories</w:t>
       </w:r>
     </w:p>
@@ -238,7 +325,7 @@
           <w:rPr>
             <w:rStyle w:val="Hyperlink"/>
           </w:rPr>
-          <w:t>https://unsplash.com/photos/a-woman-in-a-dark-headscarf-and-dress-stands-outside-SN6iygPIPnw</w:t>
+          <w:t>https://pixabay.com/photos/creepers-monster-cyber-creepy-rock-9626459/</w:t>
         </w:r>
       </w:hyperlink>
     </w:p>
@@ -316,19 +403,7 @@
           <w:rPr>
             <w:rStyle w:val="Hyperlink"/>
           </w:rPr>
-          <w:t>https://www.pexels.com/photo/ritual-accessories-on-tab</w:t>
-        </w:r>
-        <w:r>
-          <w:rPr>
-            <w:rStyle w:val="Hyperlink"/>
-          </w:rPr>
-          <w:t>l</w:t>
-        </w:r>
-        <w:r>
-          <w:rPr>
-            <w:rStyle w:val="Hyperlink"/>
-          </w:rPr>
-          <w:t>e-19997862/</w:t>
+          <w:t>https://www.pexels.com/photo/ritual-accessories-on-table-19997862/</w:t>
         </w:r>
       </w:hyperlink>
     </w:p>
@@ -339,19 +414,55 @@
             <w:rStyle w:val="Hyperlink"/>
           </w:rPr>
           <w:t>https://unsplash.com/photos/a-wooden-box-filled-with-pine-cones-and-other-items-KwcGk30kkec</w:t>
+        </w:r>
+      </w:hyperlink>
+    </w:p>
+    <w:p/>
+    <w:p>
+      <w:r>
+        <w:t>Outfits</w:t>
+      </w:r>
+    </w:p>
+    <w:p>
+      <w:hyperlink r:id="rId30" w:history="1">
+        <w:r>
+          <w:rPr>
+            <w:rStyle w:val="Hyperlink"/>
+          </w:rPr>
+          <w:t>https://pixabay.com/photos/model-creepers-monster-cyber-9566536/</w:t>
+        </w:r>
+      </w:hyperlink>
+    </w:p>
+    <w:p>
+      <w:hyperlink r:id="rId31" w:history="1">
+        <w:r>
+          <w:rPr>
+            <w:rStyle w:val="Hyperlink"/>
+          </w:rPr>
+          <w:t>https://pixabay.com/photos/creepers-monster-cyber-creepy-rock-9773186/</w:t>
+        </w:r>
+      </w:hyperlink>
+    </w:p>
+    <w:p>
+      <w:hyperlink r:id="rId32" w:history="1">
+        <w:r>
+          <w:rPr>
+            <w:rStyle w:val="Hyperlink"/>
+          </w:rPr>
+          <w:t>https://pixabay.com/photos/creepers-monster-cyber-creepy-rock-9626445/</w:t>
         </w:r>
       </w:hyperlink>
     </w:p>
     <w:p/>
     <w:p/>
+    <w:p/>
     <w:p>
       <w:r>
-        <w:lastRenderedPageBreak/>
         <w:t>Plushies</w:t>
       </w:r>
     </w:p>
     <w:p>
-      <w:hyperlink r:id="rId30" w:history="1">
+      <w:hyperlink r:id="rId33" w:history="1">
         <w:r>
           <w:rPr>
             <w:rStyle w:val="Hyperlink"/>
@@ -361,7 +472,7 @@
       </w:hyperlink>
     </w:p>
     <w:p>
-      <w:hyperlink r:id="rId31" w:history="1">
+      <w:hyperlink r:id="rId34" w:history="1">
         <w:r>
           <w:rPr>
             <w:rStyle w:val="Hyperlink"/>
@@ -371,7 +482,7 @@
       </w:hyperlink>
     </w:p>
     <w:p>
-      <w:hyperlink r:id="rId32" w:history="1">
+      <w:hyperlink r:id="rId35" w:history="1">
         <w:r>
           <w:rPr>
             <w:rStyle w:val="Hyperlink"/>
@@ -381,7 +492,7 @@
       </w:hyperlink>
     </w:p>
     <w:p>
-      <w:hyperlink r:id="rId33" w:history="1">
+      <w:hyperlink r:id="rId36" w:history="1">
         <w:r>
           <w:rPr>
             <w:rStyle w:val="Hyperlink"/>
@@ -391,7 +502,7 @@
       </w:hyperlink>
     </w:p>
     <w:p>
-      <w:hyperlink r:id="rId34" w:history="1">
+      <w:hyperlink r:id="rId37" w:history="1">
         <w:r>
           <w:rPr>
             <w:rStyle w:val="Hyperlink"/>
@@ -401,7 +512,7 @@
       </w:hyperlink>
     </w:p>
     <w:p>
-      <w:hyperlink r:id="rId35" w:history="1">
+      <w:hyperlink r:id="rId38" w:history="1">
         <w:r>
           <w:rPr>
             <w:rStyle w:val="Hyperlink"/>
@@ -419,6 +530,586 @@
     </w:sectPr>
   </w:body>
 </w:document>
+</file>
+
+<file path=word/numbering.xml><?xml version="1.0" encoding="utf-8"?>
+<w:numbering xmlns:wpc="http://schemas.microsoft.com/office/word/2010/wordprocessingCanvas" xmlns:cx="http://schemas.microsoft.com/office/drawing/2014/chartex" xmlns:cx1="http://schemas.microsoft.com/office/drawing/2015/9/8/chartex" xmlns:cx2="http://schemas.microsoft.com/office/drawing/2015/10/21/chartex" xmlns:cx3="http://schemas.microsoft.com/office/drawing/2016/5/9/chartex" xmlns:cx4="http://schemas.microsoft.com/office/drawing/2016/5/10/chartex" xmlns:cx5="http://schemas.microsoft.com/office/drawing/2016/5/11/chartex" xmlns:cx6="http://schemas.microsoft.com/office/drawing/2016/5/12/chartex" xmlns:cx7="http://schemas.microsoft.com/office/drawing/2016/5/13/chartex" xmlns:cx8="http://schemas.microsoft.com/office/drawing/2016/5/14/chartex" xmlns:mc="http://schemas.openxmlformats.org/markup-compatibility/2006" xmlns:aink="http://schemas.microsoft.com/office/drawing/2016/ink" xmlns:am3d="http://schemas.microsoft.com/office/drawing/2017/model3d" xmlns:o="urn:schemas-microsoft-com:office:office" xmlns:oel="http://schemas.microsoft.com/office/2019/extlst" xmlns:r="http://schemas.openxmlformats.org/officeDocument/2006/relationships" xmlns:m="http://schemas.openxmlformats.org/officeDocument/2006/math" xmlns:v="urn:schemas-microsoft-com:vml" xmlns:wp14="http://schemas.microsoft.com/office/word/2010/wordprocessingDrawing" xmlns:wp="http://schemas.openxmlformats.org/drawingml/2006/wordprocessingDrawing" xmlns:w10="urn:schemas-microsoft-com:office:word" xmlns:w="http://schemas.openxmlformats.org/wordprocessingml/2006/main" xmlns:w14="http://schemas.microsoft.com/office/word/2010/wordml" xmlns:w15="http://schemas.microsoft.com/office/word/2012/wordml" xmlns:w16cex="http://schemas.microsoft.com/office/word/2018/wordml/cex" xmlns:w16cid="http://schemas.microsoft.com/office/word/2016/wordml/cid" xmlns:w16="http://schemas.microsoft.com/office/word/2018/wordml" xmlns:w16du="http://schemas.microsoft.com/office/word/2023/wordml/word16du" xmlns:w16sdtdh="http://schemas.microsoft.com/office/word/2020/wordml/sdtdatahash" xmlns:w16sdtfl="http://schemas.microsoft.com/office/word/2024/wordml/sdtformatlock" xmlns:w16se="http://schemas.microsoft.com/office/word/2015/wordml/symex" xmlns:wpg="http://schemas.microsoft.com/office/word/2010/wordprocessingGroup" xmlns:wpi="http://schemas.microsoft.com/office/word/2010/wordprocessingInk" xmlns:wne="http://schemas.microsoft.com/office/word/2006/wordml" xmlns:wps="http://schemas.microsoft.com/office/word/2010/wordprocessingShape" mc:Ignorable="w14 w15 w16se w16cid w16 w16cex w16sdtdh w16sdtfl w16du wp14">
+  <w:abstractNum w:abstractNumId="0" w15:restartNumberingAfterBreak="0">
+    <w:nsid w:val="092E5E8E"/>
+    <w:multiLevelType w:val="hybridMultilevel"/>
+    <w:tmpl w:val="924E1CC6"/>
+    <w:lvl w:ilvl="0" w:tplc="CE4CDE8E">
+      <w:numFmt w:val="bullet"/>
+      <w:lvlText w:val="-"/>
+      <w:lvlJc w:val="left"/>
+      <w:pPr>
+        <w:ind w:left="720" w:hanging="360"/>
+      </w:pPr>
+      <w:rPr>
+        <w:rFonts w:ascii="Aptos" w:eastAsiaTheme="minorHAnsi" w:hAnsi="Aptos" w:cstheme="minorBidi" w:hint="default"/>
+      </w:rPr>
+    </w:lvl>
+    <w:lvl w:ilvl="1" w:tplc="04090003" w:tentative="1">
+      <w:start w:val="1"/>
+      <w:numFmt w:val="bullet"/>
+      <w:lvlText w:val="o"/>
+      <w:lvlJc w:val="left"/>
+      <w:pPr>
+        <w:ind w:left="1440" w:hanging="360"/>
+      </w:pPr>
+      <w:rPr>
+        <w:rFonts w:ascii="Courier New" w:hAnsi="Courier New" w:cs="Courier New" w:hint="default"/>
+      </w:rPr>
+    </w:lvl>
+    <w:lvl w:ilvl="2" w:tplc="04090005" w:tentative="1">
+      <w:start w:val="1"/>
+      <w:numFmt w:val="bullet"/>
+      <w:lvlText w:val=""/>
+      <w:lvlJc w:val="left"/>
+      <w:pPr>
+        <w:ind w:left="2160" w:hanging="360"/>
+      </w:pPr>
+      <w:rPr>
+        <w:rFonts w:ascii="Wingdings" w:hAnsi="Wingdings" w:hint="default"/>
+      </w:rPr>
+    </w:lvl>
+    <w:lvl w:ilvl="3" w:tplc="04090001" w:tentative="1">
+      <w:start w:val="1"/>
+      <w:numFmt w:val="bullet"/>
+      <w:lvlText w:val=""/>
+      <w:lvlJc w:val="left"/>
+      <w:pPr>
+        <w:ind w:left="2880" w:hanging="360"/>
+      </w:pPr>
+      <w:rPr>
+        <w:rFonts w:ascii="Symbol" w:hAnsi="Symbol" w:hint="default"/>
+      </w:rPr>
+    </w:lvl>
+    <w:lvl w:ilvl="4" w:tplc="04090003" w:tentative="1">
+      <w:start w:val="1"/>
+      <w:numFmt w:val="bullet"/>
+      <w:lvlText w:val="o"/>
+      <w:lvlJc w:val="left"/>
+      <w:pPr>
+        <w:ind w:left="3600" w:hanging="360"/>
+      </w:pPr>
+      <w:rPr>
+        <w:rFonts w:ascii="Courier New" w:hAnsi="Courier New" w:cs="Courier New" w:hint="default"/>
+      </w:rPr>
+    </w:lvl>
+    <w:lvl w:ilvl="5" w:tplc="04090005" w:tentative="1">
+      <w:start w:val="1"/>
+      <w:numFmt w:val="bullet"/>
+      <w:lvlText w:val=""/>
+      <w:lvlJc w:val="left"/>
+      <w:pPr>
+        <w:ind w:left="4320" w:hanging="360"/>
+      </w:pPr>
+      <w:rPr>
+        <w:rFonts w:ascii="Wingdings" w:hAnsi="Wingdings" w:hint="default"/>
+      </w:rPr>
+    </w:lvl>
+    <w:lvl w:ilvl="6" w:tplc="04090001" w:tentative="1">
+      <w:start w:val="1"/>
+      <w:numFmt w:val="bullet"/>
+      <w:lvlText w:val=""/>
+      <w:lvlJc w:val="left"/>
+      <w:pPr>
+        <w:ind w:left="5040" w:hanging="360"/>
+      </w:pPr>
+      <w:rPr>
+        <w:rFonts w:ascii="Symbol" w:hAnsi="Symbol" w:hint="default"/>
+      </w:rPr>
+    </w:lvl>
+    <w:lvl w:ilvl="7" w:tplc="04090003" w:tentative="1">
+      <w:start w:val="1"/>
+      <w:numFmt w:val="bullet"/>
+      <w:lvlText w:val="o"/>
+      <w:lvlJc w:val="left"/>
+      <w:pPr>
+        <w:ind w:left="5760" w:hanging="360"/>
+      </w:pPr>
+      <w:rPr>
+        <w:rFonts w:ascii="Courier New" w:hAnsi="Courier New" w:cs="Courier New" w:hint="default"/>
+      </w:rPr>
+    </w:lvl>
+    <w:lvl w:ilvl="8" w:tplc="04090005" w:tentative="1">
+      <w:start w:val="1"/>
+      <w:numFmt w:val="bullet"/>
+      <w:lvlText w:val=""/>
+      <w:lvlJc w:val="left"/>
+      <w:pPr>
+        <w:ind w:left="6480" w:hanging="360"/>
+      </w:pPr>
+      <w:rPr>
+        <w:rFonts w:ascii="Wingdings" w:hAnsi="Wingdings" w:hint="default"/>
+      </w:rPr>
+    </w:lvl>
+  </w:abstractNum>
+  <w:abstractNum w:abstractNumId="1" w15:restartNumberingAfterBreak="0">
+    <w:nsid w:val="0F0E4A17"/>
+    <w:multiLevelType w:val="hybridMultilevel"/>
+    <w:tmpl w:val="519641E2"/>
+    <w:lvl w:ilvl="0" w:tplc="6CF0BAA8">
+      <w:numFmt w:val="bullet"/>
+      <w:lvlText w:val="-"/>
+      <w:lvlJc w:val="left"/>
+      <w:pPr>
+        <w:ind w:left="720" w:hanging="360"/>
+      </w:pPr>
+      <w:rPr>
+        <w:rFonts w:ascii="Aptos" w:eastAsiaTheme="minorHAnsi" w:hAnsi="Aptos" w:cstheme="minorBidi" w:hint="default"/>
+      </w:rPr>
+    </w:lvl>
+    <w:lvl w:ilvl="1" w:tplc="04090003" w:tentative="1">
+      <w:start w:val="1"/>
+      <w:numFmt w:val="bullet"/>
+      <w:lvlText w:val="o"/>
+      <w:lvlJc w:val="left"/>
+      <w:pPr>
+        <w:ind w:left="1440" w:hanging="360"/>
+      </w:pPr>
+      <w:rPr>
+        <w:rFonts w:ascii="Courier New" w:hAnsi="Courier New" w:cs="Courier New" w:hint="default"/>
+      </w:rPr>
+    </w:lvl>
+    <w:lvl w:ilvl="2" w:tplc="04090005" w:tentative="1">
+      <w:start w:val="1"/>
+      <w:numFmt w:val="bullet"/>
+      <w:lvlText w:val=""/>
+      <w:lvlJc w:val="left"/>
+      <w:pPr>
+        <w:ind w:left="2160" w:hanging="360"/>
+      </w:pPr>
+      <w:rPr>
+        <w:rFonts w:ascii="Wingdings" w:hAnsi="Wingdings" w:hint="default"/>
+      </w:rPr>
+    </w:lvl>
+    <w:lvl w:ilvl="3" w:tplc="04090001" w:tentative="1">
+      <w:start w:val="1"/>
+      <w:numFmt w:val="bullet"/>
+      <w:lvlText w:val=""/>
+      <w:lvlJc w:val="left"/>
+      <w:pPr>
+        <w:ind w:left="2880" w:hanging="360"/>
+      </w:pPr>
+      <w:rPr>
+        <w:rFonts w:ascii="Symbol" w:hAnsi="Symbol" w:hint="default"/>
+      </w:rPr>
+    </w:lvl>
+    <w:lvl w:ilvl="4" w:tplc="04090003" w:tentative="1">
+      <w:start w:val="1"/>
+      <w:numFmt w:val="bullet"/>
+      <w:lvlText w:val="o"/>
+      <w:lvlJc w:val="left"/>
+      <w:pPr>
+        <w:ind w:left="3600" w:hanging="360"/>
+      </w:pPr>
+      <w:rPr>
+        <w:rFonts w:ascii="Courier New" w:hAnsi="Courier New" w:cs="Courier New" w:hint="default"/>
+      </w:rPr>
+    </w:lvl>
+    <w:lvl w:ilvl="5" w:tplc="04090005" w:tentative="1">
+      <w:start w:val="1"/>
+      <w:numFmt w:val="bullet"/>
+      <w:lvlText w:val=""/>
+      <w:lvlJc w:val="left"/>
+      <w:pPr>
+        <w:ind w:left="4320" w:hanging="360"/>
+      </w:pPr>
+      <w:rPr>
+        <w:rFonts w:ascii="Wingdings" w:hAnsi="Wingdings" w:hint="default"/>
+      </w:rPr>
+    </w:lvl>
+    <w:lvl w:ilvl="6" w:tplc="04090001" w:tentative="1">
+      <w:start w:val="1"/>
+      <w:numFmt w:val="bullet"/>
+      <w:lvlText w:val=""/>
+      <w:lvlJc w:val="left"/>
+      <w:pPr>
+        <w:ind w:left="5040" w:hanging="360"/>
+      </w:pPr>
+      <w:rPr>
+        <w:rFonts w:ascii="Symbol" w:hAnsi="Symbol" w:hint="default"/>
+      </w:rPr>
+    </w:lvl>
+    <w:lvl w:ilvl="7" w:tplc="04090003" w:tentative="1">
+      <w:start w:val="1"/>
+      <w:numFmt w:val="bullet"/>
+      <w:lvlText w:val="o"/>
+      <w:lvlJc w:val="left"/>
+      <w:pPr>
+        <w:ind w:left="5760" w:hanging="360"/>
+      </w:pPr>
+      <w:rPr>
+        <w:rFonts w:ascii="Courier New" w:hAnsi="Courier New" w:cs="Courier New" w:hint="default"/>
+      </w:rPr>
+    </w:lvl>
+    <w:lvl w:ilvl="8" w:tplc="04090005" w:tentative="1">
+      <w:start w:val="1"/>
+      <w:numFmt w:val="bullet"/>
+      <w:lvlText w:val=""/>
+      <w:lvlJc w:val="left"/>
+      <w:pPr>
+        <w:ind w:left="6480" w:hanging="360"/>
+      </w:pPr>
+      <w:rPr>
+        <w:rFonts w:ascii="Wingdings" w:hAnsi="Wingdings" w:hint="default"/>
+      </w:rPr>
+    </w:lvl>
+  </w:abstractNum>
+  <w:abstractNum w:abstractNumId="2" w15:restartNumberingAfterBreak="0">
+    <w:nsid w:val="476E7EF7"/>
+    <w:multiLevelType w:val="hybridMultilevel"/>
+    <w:tmpl w:val="716A5002"/>
+    <w:lvl w:ilvl="0" w:tplc="22E87BEC">
+      <w:numFmt w:val="bullet"/>
+      <w:lvlText w:val="-"/>
+      <w:lvlJc w:val="left"/>
+      <w:pPr>
+        <w:ind w:left="720" w:hanging="360"/>
+      </w:pPr>
+      <w:rPr>
+        <w:rFonts w:ascii="Aptos" w:eastAsiaTheme="minorHAnsi" w:hAnsi="Aptos" w:cstheme="minorBidi" w:hint="default"/>
+      </w:rPr>
+    </w:lvl>
+    <w:lvl w:ilvl="1" w:tplc="04090003" w:tentative="1">
+      <w:start w:val="1"/>
+      <w:numFmt w:val="bullet"/>
+      <w:lvlText w:val="o"/>
+      <w:lvlJc w:val="left"/>
+      <w:pPr>
+        <w:ind w:left="1440" w:hanging="360"/>
+      </w:pPr>
+      <w:rPr>
+        <w:rFonts w:ascii="Courier New" w:hAnsi="Courier New" w:cs="Courier New" w:hint="default"/>
+      </w:rPr>
+    </w:lvl>
+    <w:lvl w:ilvl="2" w:tplc="04090005" w:tentative="1">
+      <w:start w:val="1"/>
+      <w:numFmt w:val="bullet"/>
+      <w:lvlText w:val=""/>
+      <w:lvlJc w:val="left"/>
+      <w:pPr>
+        <w:ind w:left="2160" w:hanging="360"/>
+      </w:pPr>
+      <w:rPr>
+        <w:rFonts w:ascii="Wingdings" w:hAnsi="Wingdings" w:hint="default"/>
+      </w:rPr>
+    </w:lvl>
+    <w:lvl w:ilvl="3" w:tplc="04090001" w:tentative="1">
+      <w:start w:val="1"/>
+      <w:numFmt w:val="bullet"/>
+      <w:lvlText w:val=""/>
+      <w:lvlJc w:val="left"/>
+      <w:pPr>
+        <w:ind w:left="2880" w:hanging="360"/>
+      </w:pPr>
+      <w:rPr>
+        <w:rFonts w:ascii="Symbol" w:hAnsi="Symbol" w:hint="default"/>
+      </w:rPr>
+    </w:lvl>
+    <w:lvl w:ilvl="4" w:tplc="04090003" w:tentative="1">
+      <w:start w:val="1"/>
+      <w:numFmt w:val="bullet"/>
+      <w:lvlText w:val="o"/>
+      <w:lvlJc w:val="left"/>
+      <w:pPr>
+        <w:ind w:left="3600" w:hanging="360"/>
+      </w:pPr>
+      <w:rPr>
+        <w:rFonts w:ascii="Courier New" w:hAnsi="Courier New" w:cs="Courier New" w:hint="default"/>
+      </w:rPr>
+    </w:lvl>
+    <w:lvl w:ilvl="5" w:tplc="04090005" w:tentative="1">
+      <w:start w:val="1"/>
+      <w:numFmt w:val="bullet"/>
+      <w:lvlText w:val=""/>
+      <w:lvlJc w:val="left"/>
+      <w:pPr>
+        <w:ind w:left="4320" w:hanging="360"/>
+      </w:pPr>
+      <w:rPr>
+        <w:rFonts w:ascii="Wingdings" w:hAnsi="Wingdings" w:hint="default"/>
+      </w:rPr>
+    </w:lvl>
+    <w:lvl w:ilvl="6" w:tplc="04090001" w:tentative="1">
+      <w:start w:val="1"/>
+      <w:numFmt w:val="bullet"/>
+      <w:lvlText w:val=""/>
+      <w:lvlJc w:val="left"/>
+      <w:pPr>
+        <w:ind w:left="5040" w:hanging="360"/>
+      </w:pPr>
+      <w:rPr>
+        <w:rFonts w:ascii="Symbol" w:hAnsi="Symbol" w:hint="default"/>
+      </w:rPr>
+    </w:lvl>
+    <w:lvl w:ilvl="7" w:tplc="04090003" w:tentative="1">
+      <w:start w:val="1"/>
+      <w:numFmt w:val="bullet"/>
+      <w:lvlText w:val="o"/>
+      <w:lvlJc w:val="left"/>
+      <w:pPr>
+        <w:ind w:left="5760" w:hanging="360"/>
+      </w:pPr>
+      <w:rPr>
+        <w:rFonts w:ascii="Courier New" w:hAnsi="Courier New" w:cs="Courier New" w:hint="default"/>
+      </w:rPr>
+    </w:lvl>
+    <w:lvl w:ilvl="8" w:tplc="04090005" w:tentative="1">
+      <w:start w:val="1"/>
+      <w:numFmt w:val="bullet"/>
+      <w:lvlText w:val=""/>
+      <w:lvlJc w:val="left"/>
+      <w:pPr>
+        <w:ind w:left="6480" w:hanging="360"/>
+      </w:pPr>
+      <w:rPr>
+        <w:rFonts w:ascii="Wingdings" w:hAnsi="Wingdings" w:hint="default"/>
+      </w:rPr>
+    </w:lvl>
+  </w:abstractNum>
+  <w:abstractNum w:abstractNumId="3" w15:restartNumberingAfterBreak="0">
+    <w:nsid w:val="75FC207B"/>
+    <w:multiLevelType w:val="hybridMultilevel"/>
+    <w:tmpl w:val="7B7E014E"/>
+    <w:lvl w:ilvl="0" w:tplc="B4FA666A">
+      <w:numFmt w:val="bullet"/>
+      <w:lvlText w:val="-"/>
+      <w:lvlJc w:val="left"/>
+      <w:pPr>
+        <w:ind w:left="720" w:hanging="360"/>
+      </w:pPr>
+      <w:rPr>
+        <w:rFonts w:ascii="Aptos" w:eastAsiaTheme="minorHAnsi" w:hAnsi="Aptos" w:cstheme="minorBidi" w:hint="default"/>
+      </w:rPr>
+    </w:lvl>
+    <w:lvl w:ilvl="1" w:tplc="04090003" w:tentative="1">
+      <w:start w:val="1"/>
+      <w:numFmt w:val="bullet"/>
+      <w:lvlText w:val="o"/>
+      <w:lvlJc w:val="left"/>
+      <w:pPr>
+        <w:ind w:left="1440" w:hanging="360"/>
+      </w:pPr>
+      <w:rPr>
+        <w:rFonts w:ascii="Courier New" w:hAnsi="Courier New" w:cs="Courier New" w:hint="default"/>
+      </w:rPr>
+    </w:lvl>
+    <w:lvl w:ilvl="2" w:tplc="04090005" w:tentative="1">
+      <w:start w:val="1"/>
+      <w:numFmt w:val="bullet"/>
+      <w:lvlText w:val=""/>
+      <w:lvlJc w:val="left"/>
+      <w:pPr>
+        <w:ind w:left="2160" w:hanging="360"/>
+      </w:pPr>
+      <w:rPr>
+        <w:rFonts w:ascii="Wingdings" w:hAnsi="Wingdings" w:hint="default"/>
+      </w:rPr>
+    </w:lvl>
+    <w:lvl w:ilvl="3" w:tplc="04090001" w:tentative="1">
+      <w:start w:val="1"/>
+      <w:numFmt w:val="bullet"/>
+      <w:lvlText w:val=""/>
+      <w:lvlJc w:val="left"/>
+      <w:pPr>
+        <w:ind w:left="2880" w:hanging="360"/>
+      </w:pPr>
+      <w:rPr>
+        <w:rFonts w:ascii="Symbol" w:hAnsi="Symbol" w:hint="default"/>
+      </w:rPr>
+    </w:lvl>
+    <w:lvl w:ilvl="4" w:tplc="04090003" w:tentative="1">
+      <w:start w:val="1"/>
+      <w:numFmt w:val="bullet"/>
+      <w:lvlText w:val="o"/>
+      <w:lvlJc w:val="left"/>
+      <w:pPr>
+        <w:ind w:left="3600" w:hanging="360"/>
+      </w:pPr>
+      <w:rPr>
+        <w:rFonts w:ascii="Courier New" w:hAnsi="Courier New" w:cs="Courier New" w:hint="default"/>
+      </w:rPr>
+    </w:lvl>
+    <w:lvl w:ilvl="5" w:tplc="04090005" w:tentative="1">
+      <w:start w:val="1"/>
+      <w:numFmt w:val="bullet"/>
+      <w:lvlText w:val=""/>
+      <w:lvlJc w:val="left"/>
+      <w:pPr>
+        <w:ind w:left="4320" w:hanging="360"/>
+      </w:pPr>
+      <w:rPr>
+        <w:rFonts w:ascii="Wingdings" w:hAnsi="Wingdings" w:hint="default"/>
+      </w:rPr>
+    </w:lvl>
+    <w:lvl w:ilvl="6" w:tplc="04090001" w:tentative="1">
+      <w:start w:val="1"/>
+      <w:numFmt w:val="bullet"/>
+      <w:lvlText w:val=""/>
+      <w:lvlJc w:val="left"/>
+      <w:pPr>
+        <w:ind w:left="5040" w:hanging="360"/>
+      </w:pPr>
+      <w:rPr>
+        <w:rFonts w:ascii="Symbol" w:hAnsi="Symbol" w:hint="default"/>
+      </w:rPr>
+    </w:lvl>
+    <w:lvl w:ilvl="7" w:tplc="04090003" w:tentative="1">
+      <w:start w:val="1"/>
+      <w:numFmt w:val="bullet"/>
+      <w:lvlText w:val="o"/>
+      <w:lvlJc w:val="left"/>
+      <w:pPr>
+        <w:ind w:left="5760" w:hanging="360"/>
+      </w:pPr>
+      <w:rPr>
+        <w:rFonts w:ascii="Courier New" w:hAnsi="Courier New" w:cs="Courier New" w:hint="default"/>
+      </w:rPr>
+    </w:lvl>
+    <w:lvl w:ilvl="8" w:tplc="04090005" w:tentative="1">
+      <w:start w:val="1"/>
+      <w:numFmt w:val="bullet"/>
+      <w:lvlText w:val=""/>
+      <w:lvlJc w:val="left"/>
+      <w:pPr>
+        <w:ind w:left="6480" w:hanging="360"/>
+      </w:pPr>
+      <w:rPr>
+        <w:rFonts w:ascii="Wingdings" w:hAnsi="Wingdings" w:hint="default"/>
+      </w:rPr>
+    </w:lvl>
+  </w:abstractNum>
+  <w:abstractNum w:abstractNumId="4" w15:restartNumberingAfterBreak="0">
+    <w:nsid w:val="7EAF652B"/>
+    <w:multiLevelType w:val="hybridMultilevel"/>
+    <w:tmpl w:val="808E4678"/>
+    <w:lvl w:ilvl="0" w:tplc="DC84411E">
+      <w:numFmt w:val="bullet"/>
+      <w:lvlText w:val="-"/>
+      <w:lvlJc w:val="left"/>
+      <w:pPr>
+        <w:ind w:left="720" w:hanging="360"/>
+      </w:pPr>
+      <w:rPr>
+        <w:rFonts w:ascii="Aptos" w:eastAsiaTheme="minorHAnsi" w:hAnsi="Aptos" w:cstheme="minorBidi" w:hint="default"/>
+      </w:rPr>
+    </w:lvl>
+    <w:lvl w:ilvl="1" w:tplc="04090003" w:tentative="1">
+      <w:start w:val="1"/>
+      <w:numFmt w:val="bullet"/>
+      <w:lvlText w:val="o"/>
+      <w:lvlJc w:val="left"/>
+      <w:pPr>
+        <w:ind w:left="1440" w:hanging="360"/>
+      </w:pPr>
+      <w:rPr>
+        <w:rFonts w:ascii="Courier New" w:hAnsi="Courier New" w:cs="Courier New" w:hint="default"/>
+      </w:rPr>
+    </w:lvl>
+    <w:lvl w:ilvl="2" w:tplc="04090005" w:tentative="1">
+      <w:start w:val="1"/>
+      <w:numFmt w:val="bullet"/>
+      <w:lvlText w:val=""/>
+      <w:lvlJc w:val="left"/>
+      <w:pPr>
+        <w:ind w:left="2160" w:hanging="360"/>
+      </w:pPr>
+      <w:rPr>
+        <w:rFonts w:ascii="Wingdings" w:hAnsi="Wingdings" w:hint="default"/>
+      </w:rPr>
+    </w:lvl>
+    <w:lvl w:ilvl="3" w:tplc="04090001" w:tentative="1">
+      <w:start w:val="1"/>
+      <w:numFmt w:val="bullet"/>
+      <w:lvlText w:val=""/>
+      <w:lvlJc w:val="left"/>
+      <w:pPr>
+        <w:ind w:left="2880" w:hanging="360"/>
+      </w:pPr>
+      <w:rPr>
+        <w:rFonts w:ascii="Symbol" w:hAnsi="Symbol" w:hint="default"/>
+      </w:rPr>
+    </w:lvl>
+    <w:lvl w:ilvl="4" w:tplc="04090003" w:tentative="1">
+      <w:start w:val="1"/>
+      <w:numFmt w:val="bullet"/>
+      <w:lvlText w:val="o"/>
+      <w:lvlJc w:val="left"/>
+      <w:pPr>
+        <w:ind w:left="3600" w:hanging="360"/>
+      </w:pPr>
+      <w:rPr>
+        <w:rFonts w:ascii="Courier New" w:hAnsi="Courier New" w:cs="Courier New" w:hint="default"/>
+      </w:rPr>
+    </w:lvl>
+    <w:lvl w:ilvl="5" w:tplc="04090005" w:tentative="1">
+      <w:start w:val="1"/>
+      <w:numFmt w:val="bullet"/>
+      <w:lvlText w:val=""/>
+      <w:lvlJc w:val="left"/>
+      <w:pPr>
+        <w:ind w:left="4320" w:hanging="360"/>
+      </w:pPr>
+      <w:rPr>
+        <w:rFonts w:ascii="Wingdings" w:hAnsi="Wingdings" w:hint="default"/>
+      </w:rPr>
+    </w:lvl>
+    <w:lvl w:ilvl="6" w:tplc="04090001" w:tentative="1">
+      <w:start w:val="1"/>
+      <w:numFmt w:val="bullet"/>
+      <w:lvlText w:val=""/>
+      <w:lvlJc w:val="left"/>
+      <w:pPr>
+        <w:ind w:left="5040" w:hanging="360"/>
+      </w:pPr>
+      <w:rPr>
+        <w:rFonts w:ascii="Symbol" w:hAnsi="Symbol" w:hint="default"/>
+      </w:rPr>
+    </w:lvl>
+    <w:lvl w:ilvl="7" w:tplc="04090003" w:tentative="1">
+      <w:start w:val="1"/>
+      <w:numFmt w:val="bullet"/>
+      <w:lvlText w:val="o"/>
+      <w:lvlJc w:val="left"/>
+      <w:pPr>
+        <w:ind w:left="5760" w:hanging="360"/>
+      </w:pPr>
+      <w:rPr>
+        <w:rFonts w:ascii="Courier New" w:hAnsi="Courier New" w:cs="Courier New" w:hint="default"/>
+      </w:rPr>
+    </w:lvl>
+    <w:lvl w:ilvl="8" w:tplc="04090005" w:tentative="1">
+      <w:start w:val="1"/>
+      <w:numFmt w:val="bullet"/>
+      <w:lvlText w:val=""/>
+      <w:lvlJc w:val="left"/>
+      <w:pPr>
+        <w:ind w:left="6480" w:hanging="360"/>
+      </w:pPr>
+      <w:rPr>
+        <w:rFonts w:ascii="Wingdings" w:hAnsi="Wingdings" w:hint="default"/>
+      </w:rPr>
+    </w:lvl>
+  </w:abstractNum>
+  <w:num w:numId="1" w16cid:durableId="18824661">
+    <w:abstractNumId w:val="0"/>
+  </w:num>
+  <w:num w:numId="2" w16cid:durableId="1420371902">
+    <w:abstractNumId w:val="4"/>
+  </w:num>
+  <w:num w:numId="3" w16cid:durableId="938562293">
+    <w:abstractNumId w:val="3"/>
+  </w:num>
+  <w:num w:numId="4" w16cid:durableId="664666139">
+    <w:abstractNumId w:val="1"/>
+  </w:num>
+  <w:num w:numId="5" w16cid:durableId="1292442949">
+    <w:abstractNumId w:val="2"/>
+  </w:num>
+</w:numbering>
 </file>
 
 <file path=word/styles.xml><?xml version="1.0" encoding="utf-8"?>

</xml_diff>

<commit_message>
added more outfits to styles page, fixed json to match new imgs
</commit_message>
<xml_diff>
--- a/Citations.docx
+++ b/Citations.docx
@@ -361,7 +361,19 @@
           <w:rPr>
             <w:rStyle w:val="Hyperlink"/>
           </w:rPr>
-          <w:t>https://unsplash.com/photos/a-black-object-on-a-tree-stump-EN88mEDYO-0</w:t>
+          <w:t>https://unsplash.com/photos/a-black-object-on-a-tree-stump-EN88m</w:t>
+        </w:r>
+        <w:r>
+          <w:rPr>
+            <w:rStyle w:val="Hyperlink"/>
+          </w:rPr>
+          <w:t>E</w:t>
+        </w:r>
+        <w:r>
+          <w:rPr>
+            <w:rStyle w:val="Hyperlink"/>
+          </w:rPr>
+          <w:t>DYO-0</w:t>
         </w:r>
       </w:hyperlink>
     </w:p>
@@ -386,14 +398,25 @@
       </w:hyperlink>
     </w:p>
     <w:p/>
-    <w:p/>
     <w:p>
       <w:hyperlink r:id="rId27" w:history="1">
         <w:r>
           <w:rPr>
             <w:rStyle w:val="Hyperlink"/>
           </w:rPr>
-          <w:t>https://www.pexels.com/photo/candles-and-book-on-ritual-table-19997863/</w:t>
+          <w:t>https://www.pexels.com/photo/candles-and-book-on-r</w:t>
+        </w:r>
+        <w:r>
+          <w:rPr>
+            <w:rStyle w:val="Hyperlink"/>
+          </w:rPr>
+          <w:t>i</w:t>
+        </w:r>
+        <w:r>
+          <w:rPr>
+            <w:rStyle w:val="Hyperlink"/>
+          </w:rPr>
+          <w:t>tual-table-19997863/</w:t>
         </w:r>
       </w:hyperlink>
     </w:p>
@@ -403,7 +426,19 @@
           <w:rPr>
             <w:rStyle w:val="Hyperlink"/>
           </w:rPr>
-          <w:t>https://www.pexels.com/photo/ritual-accessories-on-table-19997862/</w:t>
+          <w:t>https://www.pexels.com/photo/ritual-accessories-on-table-199978</w:t>
+        </w:r>
+        <w:r>
+          <w:rPr>
+            <w:rStyle w:val="Hyperlink"/>
+          </w:rPr>
+          <w:t>6</w:t>
+        </w:r>
+        <w:r>
+          <w:rPr>
+            <w:rStyle w:val="Hyperlink"/>
+          </w:rPr>
+          <w:t>2/</w:t>
         </w:r>
       </w:hyperlink>
     </w:p>
@@ -413,7 +448,19 @@
           <w:rPr>
             <w:rStyle w:val="Hyperlink"/>
           </w:rPr>
-          <w:t>https://unsplash.com/photos/a-wooden-box-filled-with-pine-cones-and-other-items-KwcGk30kkec</w:t>
+          <w:t>https://unsplash.com/photos/a-wooden-box-filled-with-pine-cones-</w:t>
+        </w:r>
+        <w:r>
+          <w:rPr>
+            <w:rStyle w:val="Hyperlink"/>
+          </w:rPr>
+          <w:t>a</w:t>
+        </w:r>
+        <w:r>
+          <w:rPr>
+            <w:rStyle w:val="Hyperlink"/>
+          </w:rPr>
+          <w:t>nd-other-items-KwcGk30kkec</w:t>
         </w:r>
       </w:hyperlink>
     </w:p>
@@ -450,74 +497,6 @@
             <w:rStyle w:val="Hyperlink"/>
           </w:rPr>
           <w:t>https://pixabay.com/photos/creepers-monster-cyber-creepy-rock-9626445/</w:t>
-        </w:r>
-      </w:hyperlink>
-    </w:p>
-    <w:p/>
-    <w:p/>
-    <w:p/>
-    <w:p>
-      <w:r>
-        <w:t>Plushies</w:t>
-      </w:r>
-    </w:p>
-    <w:p>
-      <w:hyperlink r:id="rId33" w:history="1">
-        <w:r>
-          <w:rPr>
-            <w:rStyle w:val="Hyperlink"/>
-          </w:rPr>
-          <w:t>https://www.pexels.com/photo/white-rabbit-plush-toy-688311/</w:t>
-        </w:r>
-      </w:hyperlink>
-    </w:p>
-    <w:p>
-      <w:hyperlink r:id="rId34" w:history="1">
-        <w:r>
-          <w:rPr>
-            <w:rStyle w:val="Hyperlink"/>
-          </w:rPr>
-          <w:t>https://www.pexels.com/photo/jack-skelington-vinyl-figure-619419/</w:t>
-        </w:r>
-      </w:hyperlink>
-    </w:p>
-    <w:p>
-      <w:hyperlink r:id="rId35" w:history="1">
-        <w:r>
-          <w:rPr>
-            <w:rStyle w:val="Hyperlink"/>
-          </w:rPr>
-          <w:t>https://www.pexels.com/photo/brown-teddy-bear-sitting-on-edge-of-pavement-105531/</w:t>
-        </w:r>
-      </w:hyperlink>
-    </w:p>
-    <w:p>
-      <w:hyperlink r:id="rId36" w:history="1">
-        <w:r>
-          <w:rPr>
-            <w:rStyle w:val="Hyperlink"/>
-          </w:rPr>
-          <w:t>https://www.pexels.com/photo/a-scary-clown-costume-10185608/</w:t>
-        </w:r>
-      </w:hyperlink>
-    </w:p>
-    <w:p>
-      <w:hyperlink r:id="rId37" w:history="1">
-        <w:r>
-          <w:rPr>
-            <w:rStyle w:val="Hyperlink"/>
-          </w:rPr>
-          <w:t>https://unsplash.com/photos/plush-skeleton-toy-attached-to-weathered-wooden-post-5O4fpYPt6hU</w:t>
-        </w:r>
-      </w:hyperlink>
-    </w:p>
-    <w:p>
-      <w:hyperlink r:id="rId38" w:history="1">
-        <w:r>
-          <w:rPr>
-            <w:rStyle w:val="Hyperlink"/>
-          </w:rPr>
-          <w:t>https://unsplash.com/photos/a-stuffed-animal-with-big-eyes-and-a-mouth-MS3Xuuadl4E</w:t>
         </w:r>
       </w:hyperlink>
     </w:p>

</xml_diff>

<commit_message>
updated blog,json file, finished blog page and each details page, added more text to styles & home pages, fixed Card import errors, restructured folder structure, added reviews section to home page. NOW FINISHED
</commit_message>
<xml_diff>
--- a/Citations.docx
+++ b/Citations.docx
@@ -61,31 +61,7 @@
           <w:rPr>
             <w:rStyle w:val="Hyperlink"/>
           </w:rPr>
-          <w:t>https://pixabay.com/photos/creepers-monster-cyber-cr</w:t>
-        </w:r>
-        <w:r>
-          <w:rPr>
-            <w:rStyle w:val="Hyperlink"/>
-          </w:rPr>
-          <w:t>e</w:t>
-        </w:r>
-        <w:r>
-          <w:rPr>
-            <w:rStyle w:val="Hyperlink"/>
-          </w:rPr>
-          <w:t>epy-rock-</w:t>
-        </w:r>
-        <w:r>
-          <w:rPr>
-            <w:rStyle w:val="Hyperlink"/>
-          </w:rPr>
-          <w:t>9</w:t>
-        </w:r>
-        <w:r>
-          <w:rPr>
-            <w:rStyle w:val="Hyperlink"/>
-          </w:rPr>
-          <w:t>262162/</w:t>
+          <w:t>https://pixabay.com/photos/creepers-monster-cyber-creepy-rock-9262162/</w:t>
         </w:r>
       </w:hyperlink>
     </w:p>
@@ -95,19 +71,7 @@
           <w:rPr>
             <w:rStyle w:val="Hyperlink"/>
           </w:rPr>
-          <w:t>https://pixabay.com/photos/model-creepers-monster-cy</w:t>
-        </w:r>
-        <w:r>
-          <w:rPr>
-            <w:rStyle w:val="Hyperlink"/>
-          </w:rPr>
-          <w:t>b</w:t>
-        </w:r>
-        <w:r>
-          <w:rPr>
-            <w:rStyle w:val="Hyperlink"/>
-          </w:rPr>
-          <w:t>er-9566573/</w:t>
+          <w:t>https://pixabay.com/photos/model-creepers-monster-cyber-9566573/</w:t>
         </w:r>
       </w:hyperlink>
     </w:p>
@@ -117,31 +81,7 @@
           <w:rPr>
             <w:rStyle w:val="Hyperlink"/>
           </w:rPr>
-          <w:t>https://pixabay.com/photos/model-rock-punk-goth-a</w:t>
-        </w:r>
-        <w:r>
-          <w:rPr>
-            <w:rStyle w:val="Hyperlink"/>
-          </w:rPr>
-          <w:t>e</w:t>
-        </w:r>
-        <w:r>
-          <w:rPr>
-            <w:rStyle w:val="Hyperlink"/>
-          </w:rPr>
-          <w:t>sthetic-96</w:t>
-        </w:r>
-        <w:r>
-          <w:rPr>
-            <w:rStyle w:val="Hyperlink"/>
-          </w:rPr>
-          <w:t>5</w:t>
-        </w:r>
-        <w:r>
-          <w:rPr>
-            <w:rStyle w:val="Hyperlink"/>
-          </w:rPr>
-          <w:t>7424/</w:t>
+          <w:t>https://pixabay.com/photos/model-rock-punk-goth-aesthetic-9657424/</w:t>
         </w:r>
       </w:hyperlink>
     </w:p>
@@ -161,19 +101,7 @@
           <w:rPr>
             <w:rStyle w:val="Hyperlink"/>
           </w:rPr>
-          <w:t>https://pixabay.com/photos/creepers-monster-cyber-creepy-rock-9</w:t>
-        </w:r>
-        <w:r>
-          <w:rPr>
-            <w:rStyle w:val="Hyperlink"/>
-          </w:rPr>
-          <w:t>6</w:t>
-        </w:r>
-        <w:r>
-          <w:rPr>
-            <w:rStyle w:val="Hyperlink"/>
-          </w:rPr>
-          <w:t>53850/</w:t>
+          <w:t>https://pixabay.com/photos/creepers-monster-cyber-creepy-rock-9653850/</w:t>
         </w:r>
       </w:hyperlink>
     </w:p>
@@ -183,19 +111,7 @@
           <w:rPr>
             <w:rStyle w:val="Hyperlink"/>
           </w:rPr>
-          <w:t>https://pixabay.com/photos/woman-model-creepers-creepy-rock</w:t>
-        </w:r>
-        <w:r>
-          <w:rPr>
-            <w:rStyle w:val="Hyperlink"/>
-          </w:rPr>
-          <w:t>-</w:t>
-        </w:r>
-        <w:r>
-          <w:rPr>
-            <w:rStyle w:val="Hyperlink"/>
-          </w:rPr>
-          <w:t>9566584/</w:t>
+          <w:t>https://pixabay.com/photos/woman-model-creepers-creepy-rock-9566584/</w:t>
         </w:r>
       </w:hyperlink>
     </w:p>
@@ -205,19 +121,7 @@
           <w:rPr>
             <w:rStyle w:val="Hyperlink"/>
           </w:rPr>
-          <w:t>https://pixabay.com/photos/creepers-monster-cyber-creepy-rock</w:t>
-        </w:r>
-        <w:r>
-          <w:rPr>
-            <w:rStyle w:val="Hyperlink"/>
-          </w:rPr>
-          <w:t>-</w:t>
-        </w:r>
-        <w:r>
-          <w:rPr>
-            <w:rStyle w:val="Hyperlink"/>
-          </w:rPr>
-          <w:t>9773182/</w:t>
+          <w:t>https://pixabay.com/photos/creepers-monster-cyber-creepy-rock-9773182/</w:t>
         </w:r>
       </w:hyperlink>
     </w:p>
@@ -361,19 +265,7 @@
           <w:rPr>
             <w:rStyle w:val="Hyperlink"/>
           </w:rPr>
-          <w:t>https://unsplash.com/photos/a-black-object-on-a-tree-stump-EN88m</w:t>
-        </w:r>
-        <w:r>
-          <w:rPr>
-            <w:rStyle w:val="Hyperlink"/>
-          </w:rPr>
-          <w:t>E</w:t>
-        </w:r>
-        <w:r>
-          <w:rPr>
-            <w:rStyle w:val="Hyperlink"/>
-          </w:rPr>
-          <w:t>DYO-0</w:t>
+          <w:t>https://unsplash.com/photos/a-black-object-on-a-tree-stump-EN88mEDYO-0</w:t>
         </w:r>
       </w:hyperlink>
     </w:p>
@@ -394,73 +286,6 @@
             <w:rStyle w:val="Hyperlink"/>
           </w:rPr>
           <w:t>https://unsplash.com/photos/assorted-stones-MnKWt1W1GDg</w:t>
-        </w:r>
-      </w:hyperlink>
-    </w:p>
-    <w:p/>
-    <w:p>
-      <w:hyperlink r:id="rId27" w:history="1">
-        <w:r>
-          <w:rPr>
-            <w:rStyle w:val="Hyperlink"/>
-          </w:rPr>
-          <w:t>https://www.pexels.com/photo/candles-and-book-on-r</w:t>
-        </w:r>
-        <w:r>
-          <w:rPr>
-            <w:rStyle w:val="Hyperlink"/>
-          </w:rPr>
-          <w:t>i</w:t>
-        </w:r>
-        <w:r>
-          <w:rPr>
-            <w:rStyle w:val="Hyperlink"/>
-          </w:rPr>
-          <w:t>tual-table-19997863/</w:t>
-        </w:r>
-      </w:hyperlink>
-    </w:p>
-    <w:p>
-      <w:hyperlink r:id="rId28" w:history="1">
-        <w:r>
-          <w:rPr>
-            <w:rStyle w:val="Hyperlink"/>
-          </w:rPr>
-          <w:t>https://www.pexels.com/photo/ritual-accessories-on-table-199978</w:t>
-        </w:r>
-        <w:r>
-          <w:rPr>
-            <w:rStyle w:val="Hyperlink"/>
-          </w:rPr>
-          <w:t>6</w:t>
-        </w:r>
-        <w:r>
-          <w:rPr>
-            <w:rStyle w:val="Hyperlink"/>
-          </w:rPr>
-          <w:t>2/</w:t>
-        </w:r>
-      </w:hyperlink>
-    </w:p>
-    <w:p>
-      <w:hyperlink r:id="rId29" w:history="1">
-        <w:r>
-          <w:rPr>
-            <w:rStyle w:val="Hyperlink"/>
-          </w:rPr>
-          <w:t>https://unsplash.com/photos/a-wooden-box-filled-with-pine-cones-</w:t>
-        </w:r>
-        <w:r>
-          <w:rPr>
-            <w:rStyle w:val="Hyperlink"/>
-          </w:rPr>
-          <w:t>a</w:t>
-        </w:r>
-        <w:r>
-          <w:rPr>
-            <w:rStyle w:val="Hyperlink"/>
-          </w:rPr>
-          <w:t>nd-other-items-KwcGk30kkec</w:t>
         </w:r>
       </w:hyperlink>
     </w:p>
@@ -471,14 +296,50 @@
       </w:r>
     </w:p>
     <w:p>
+      <w:hyperlink r:id="rId27" w:history="1">
+        <w:r>
+          <w:rPr>
+            <w:rStyle w:val="Hyperlink"/>
+          </w:rPr>
+          <w:t>https://pixabay.com/photos/model-creepers-monster-cyber-9566536/</w:t>
+        </w:r>
+      </w:hyperlink>
+    </w:p>
+    <w:p>
+      <w:hyperlink r:id="rId28" w:history="1">
+        <w:r>
+          <w:rPr>
+            <w:rStyle w:val="Hyperlink"/>
+          </w:rPr>
+          <w:t>https://pixabay.com/photos/creepers-monster-cyber-creepy-rock-9773186/</w:t>
+        </w:r>
+      </w:hyperlink>
+    </w:p>
+    <w:p>
+      <w:hyperlink r:id="rId29" w:history="1">
+        <w:r>
+          <w:rPr>
+            <w:rStyle w:val="Hyperlink"/>
+          </w:rPr>
+          <w:t>https://pixabay.com/photos/creepers-monster-cyber-creepy-rock-9626445/</w:t>
+        </w:r>
+      </w:hyperlink>
+    </w:p>
+    <w:p>
       <w:hyperlink r:id="rId30" w:history="1">
         <w:r>
           <w:rPr>
             <w:rStyle w:val="Hyperlink"/>
           </w:rPr>
-          <w:t>https://pixabay.com/photos/model-creepers-monster-cyber-9566536/</w:t>
-        </w:r>
-      </w:hyperlink>
+          <w:t>https://pixabay.com/photos/model-rock-punk-goth-aesthetic-9657425/</w:t>
+        </w:r>
+      </w:hyperlink>
+    </w:p>
+    <w:p/>
+    <w:p>
+      <w:r>
+        <w:t>Blog</w:t>
+      </w:r>
     </w:p>
     <w:p>
       <w:hyperlink r:id="rId31" w:history="1">
@@ -486,7 +347,7 @@
           <w:rPr>
             <w:rStyle w:val="Hyperlink"/>
           </w:rPr>
-          <w:t>https://pixabay.com/photos/creepers-monster-cyber-creepy-rock-9773186/</w:t>
+          <w:t>https://www.pexels.com/photo/a-man-wearing-a-black-leather-outfit-10660100/</w:t>
         </w:r>
       </w:hyperlink>
     </w:p>
@@ -496,11 +357,110 @@
           <w:rPr>
             <w:rStyle w:val="Hyperlink"/>
           </w:rPr>
-          <w:t>https://pixabay.com/photos/creepers-monster-cyber-creepy-rock-9626445/</w:t>
-        </w:r>
-      </w:hyperlink>
-    </w:p>
-    <w:p/>
+          <w:t>https://pixabay.com/photos/model-monster-creepy-rock-punk-9755888/</w:t>
+        </w:r>
+      </w:hyperlink>
+    </w:p>
+    <w:p>
+      <w:hyperlink r:id="rId33" w:history="1">
+        <w:r>
+          <w:rPr>
+            <w:rStyle w:val="Hyperlink"/>
+          </w:rPr>
+          <w:t>https://www.pexels.com/photo/woman-holding-flower-bouquet-1035682/</w:t>
+        </w:r>
+      </w:hyperlink>
+    </w:p>
+    <w:p>
+      <w:hyperlink r:id="rId34" w:history="1">
+        <w:r>
+          <w:rPr>
+            <w:rStyle w:val="Hyperlink"/>
+          </w:rPr>
+          <w:t>https://pixabay.com/photos/model-monster-creepy-rock-punk-9755889/</w:t>
+        </w:r>
+      </w:hyperlink>
+    </w:p>
+    <w:p>
+      <w:hyperlink r:id="rId35" w:history="1">
+        <w:r>
+          <w:rPr>
+            <w:rStyle w:val="Hyperlink"/>
+          </w:rPr>
+          <w:t>https://unsplash.com/photos/a-woman-twirls-in-front-of-an-industrial-backdrop-gvoxf2r2Xng</w:t>
+        </w:r>
+      </w:hyperlink>
+    </w:p>
+    <w:p>
+      <w:hyperlink r:id="rId36" w:history="1">
+        <w:r>
+          <w:rPr>
+            <w:rStyle w:val="Hyperlink"/>
+          </w:rPr>
+          <w:t>https://pixabay.com/photos/creepers-monster-cyber-creepy-rock-9262164/</w:t>
+        </w:r>
+      </w:hyperlink>
+    </w:p>
+    <w:p>
+      <w:hyperlink r:id="rId37" w:history="1">
+        <w:r>
+          <w:rPr>
+            <w:rStyle w:val="Hyperlink"/>
+          </w:rPr>
+          <w:t>https://www.pexels.com/photo/woman-in-black-top-holding-a-book-5899023/</w:t>
+        </w:r>
+      </w:hyperlink>
+    </w:p>
+    <w:p>
+      <w:hyperlink r:id="rId38" w:history="1">
+        <w:r>
+          <w:rPr>
+            <w:rStyle w:val="Hyperlink"/>
+          </w:rPr>
+          <w:t>https://pixabay.com/photos/creepers-monster-cyber-creepy-rock-9588717/</w:t>
+        </w:r>
+      </w:hyperlink>
+    </w:p>
+    <w:p>
+      <w:hyperlink r:id="rId39" w:history="1">
+        <w:r>
+          <w:rPr>
+            <w:rStyle w:val="Hyperlink"/>
+          </w:rPr>
+          <w:t>https://www.pexels.com/photo/woman-posing-in-black-jacket-15650015/</w:t>
+        </w:r>
+      </w:hyperlink>
+    </w:p>
+    <w:p>
+      <w:hyperlink r:id="rId40" w:history="1">
+        <w:r>
+          <w:rPr>
+            <w:rStyle w:val="Hyperlink"/>
+          </w:rPr>
+          <w:t>https://pixabay.com/photos/creepers-monster-cyber-creepy-rock-9588735/</w:t>
+        </w:r>
+      </w:hyperlink>
+    </w:p>
+    <w:p>
+      <w:hyperlink r:id="rId41" w:history="1">
+        <w:r>
+          <w:rPr>
+            <w:rStyle w:val="Hyperlink"/>
+          </w:rPr>
+          <w:t>https://www.pexels.com/photo/gothic-woman-with-dramatic-makeup-outdoors-29783032/</w:t>
+        </w:r>
+      </w:hyperlink>
+    </w:p>
+    <w:p>
+      <w:hyperlink r:id="rId42" w:history="1">
+        <w:r>
+          <w:rPr>
+            <w:rStyle w:val="Hyperlink"/>
+          </w:rPr>
+          <w:t>https://pixabay.com/photos/creepers-monster-cyber-creepy-rock-9626451/</w:t>
+        </w:r>
+      </w:hyperlink>
+    </w:p>
     <w:sectPr>
       <w:pgSz w:w="12240" w:h="15840"/>
       <w:pgMar w:top="1440" w:right="1440" w:bottom="1440" w:left="1440" w:header="720" w:footer="720" w:gutter="0"/>

</xml_diff>